<commit_message>
Fix: Inject missing XML tags into contract template (v1.0.3)
</commit_message>
<xml_diff>
--- a/Padlás födém szigetelés dokumentum managment/templates/kivitelezoi_nyilatkozat.docx
+++ b/Padlás födém szigetelés dokumentum managment/templates/kivitelezoi_nyilatkozat.docx
@@ -7352,6 +7352,163 @@
         </w:rPr>
         <w:tab/>
         <w:t xml:space="preserve"> </w:t>
+      </w:r>
+    </w:p>
+    <w:p>
+      <w:pPr>
+        <w:jc w:val="both"/>
+        <w:rPr>
+          <w:sz w:val="21"/>
+          <w:szCs w:val="21"/>
+        </w:rPr>
+      </w:pPr>
+    </w:p>
+    <w:p>
+      <w:pPr>
+        <w:jc w:val="both"/>
+        <w:rPr>
+          <w:b/>
+          <w:sz w:val="21"/>
+          <w:szCs w:val="21"/>
+        </w:rPr>
+      </w:pPr>
+      <w:r>
+        <w:rPr>
+          <w:b/>
+          <w:sz w:val="21"/>
+          <w:szCs w:val="21"/>
+        </w:rPr>
+        <w:t>Nyilatkozom a padlásfeljáró szigeteléséről:</w:t>
+      </w:r>
+    </w:p>
+    <w:p>
+      <w:pPr>
+        <w:jc w:val="both"/>
+        <w:rPr>
+          <w:sz w:val="21"/>
+          <w:szCs w:val="21"/>
+        </w:rPr>
+      </w:pPr>
+      <w:r>
+        <w:rPr>
+          <w:sz w:val="21"/>
+          <w:szCs w:val="21"/>
+        </w:rPr>
+        <w:t>[[padlasfeljaro_szigetelese_igen]] A padlásfeljáró ajtó szigetelve lett.</w:t>
+      </w:r>
+    </w:p>
+    <w:p>
+      <w:pPr>
+        <w:jc w:val="both"/>
+        <w:rPr>
+          <w:sz w:val="21"/>
+          <w:szCs w:val="21"/>
+        </w:rPr>
+      </w:pPr>
+      <w:r>
+        <w:rPr>
+          <w:sz w:val="21"/>
+          <w:szCs w:val="21"/>
+        </w:rPr>
+        <w:t>[[padlasfeljaro_szigetelese_nem]] A padlásfeljáró ajtó NEM lett szigetelve.</w:t>
+      </w:r>
+    </w:p>
+    <w:p>
+      <w:pPr>
+        <w:jc w:val="both"/>
+        <w:rPr>
+          <w:b/>
+          <w:sz w:val="21"/>
+          <w:szCs w:val="21"/>
+        </w:rPr>
+      </w:pPr>
+      <w:r>
+        <w:rPr>
+          <w:b/>
+          <w:sz w:val="21"/>
+          <w:szCs w:val="21"/>
+        </w:rPr>
+        <w:t>Padlásfödémen kívül szigetelésre került:</w:t>
+      </w:r>
+    </w:p>
+    <w:p>
+      <w:pPr>
+        <w:jc w:val="both"/>
+        <w:rPr>
+          <w:sz w:val="21"/>
+          <w:szCs w:val="21"/>
+        </w:rPr>
+      </w:pPr>
+      <w:r>
+        <w:rPr>
+          <w:sz w:val="21"/>
+          <w:szCs w:val="21"/>
+        </w:rPr>
+        <w:t>[[pf_kivul_fodemen]] Padlásfödém</w:t>
+      </w:r>
+    </w:p>
+    <w:p>
+      <w:pPr>
+        <w:jc w:val="both"/>
+        <w:rPr>
+          <w:sz w:val="21"/>
+          <w:szCs w:val="21"/>
+        </w:rPr>
+      </w:pPr>
+      <w:r>
+        <w:rPr>
+          <w:sz w:val="21"/>
+          <w:szCs w:val="21"/>
+        </w:rPr>
+        <w:t>[[pf_kivul_oromfal]] Oromfal</w:t>
+      </w:r>
+    </w:p>
+    <w:p>
+      <w:pPr>
+        <w:jc w:val="both"/>
+        <w:rPr>
+          <w:sz w:val="21"/>
+          <w:szCs w:val="21"/>
+        </w:rPr>
+      </w:pPr>
+      <w:r>
+        <w:rPr>
+          <w:sz w:val="21"/>
+          <w:szCs w:val="21"/>
+        </w:rPr>
+        <w:t>[[pf_kivul_bonthato]] Bontható</w:t>
+      </w:r>
+    </w:p>
+    <w:p>
+      <w:pPr>
+        <w:jc w:val="both"/>
+        <w:rPr>
+          <w:sz w:val="21"/>
+          <w:szCs w:val="21"/>
+        </w:rPr>
+      </w:pPr>
+      <w:r>
+        <w:rPr>
+          <w:sz w:val="21"/>
+          <w:szCs w:val="21"/>
+        </w:rPr>
+        <w:t>[[pf_kivul_egyeb]] Egyéb: [[pf_kivul_egyeb_szoveg]]</w:t>
+      </w:r>
+    </w:p>
+    <w:p>
+      <w:pPr>
+        <w:jc w:val="both"/>
+        <w:rPr>
+          <w:sz w:val="21"/>
+          <w:szCs w:val="21"/>
+        </w:rPr>
+      </w:pPr>
+      <w:r>
+        <w:rPr>
+          <w:sz w:val="21"/>
+          <w:szCs w:val="21"/>
+        </w:rPr>
+        <w:t/>
       </w:r>
     </w:p>
     <w:p>

</xml_diff>